<commit_message>
update invoice template file
</commit_message>
<xml_diff>
--- a/templates/invoice.docx
+++ b/templates/invoice.docx
@@ -738,34 +738,80 @@
       <w:pPr>
         <w:jc w:val="both"/>
         <w:rPr>
-          <w:rFonts w:ascii="Calibri" w:hAnsi="Calibri" w:cs="Calibri"/>
-          <w:sz w:val="22"/>
-          <w:szCs w:val="22"/>
-          <w:lang w:val="id-ID"/>
+          <w:rFonts w:hint="default" w:ascii="Calibri" w:hAnsi="Calibri" w:cs="Calibri"/>
+          <w:sz w:val="22"/>
+          <w:szCs w:val="22"/>
+          <w:lang w:val="en-US"/>
         </w:rPr>
       </w:pPr>
       <w:r>
         <w:rPr>
-          <w:rFonts w:ascii="Calibri" w:hAnsi="Calibri" w:cs="Calibri"/>
-          <w:sz w:val="22"/>
-          <w:szCs w:val="22"/>
-          <w:lang w:val="id-ID"/>
-        </w:rPr>
-        <w:t>Biaya dapat di kirim ke:</w:t>
+          <w:rFonts w:hint="default" w:ascii="Calibri" w:hAnsi="Calibri" w:cs="Calibri"/>
+          <w:sz w:val="22"/>
+          <w:szCs w:val="22"/>
+          <w:lang w:val="en-US"/>
+        </w:rPr>
+        <w:t>Keterangan:</w:t>
       </w:r>
     </w:p>
     <w:p>
       <w:pPr>
         <w:jc w:val="both"/>
         <w:rPr>
-          <w:rFonts w:ascii="Calibri" w:hAnsi="Calibri" w:cs="Calibri"/>
+          <w:rFonts w:hint="default" w:ascii="Calibri" w:hAnsi="Calibri" w:cs="Calibri"/>
           <w:b/>
+          <w:bCs/>
+          <w:sz w:val="22"/>
+          <w:szCs w:val="22"/>
+          <w:lang w:val="en-US"/>
+        </w:rPr>
+      </w:pPr>
+      <w:r>
+        <w:rPr>
+          <w:rFonts w:hint="default" w:ascii="Calibri" w:hAnsi="Calibri" w:cs="Calibri"/>
+          <w:b/>
+          <w:bCs/>
+          <w:sz w:val="22"/>
+          <w:szCs w:val="22"/>
+          <w:lang w:val="en-US"/>
+        </w:rPr>
+        <w:t>Harga tidak termasuk pajak</w:t>
+      </w:r>
+    </w:p>
+    <w:p>
+      <w:pPr>
+        <w:jc w:val="both"/>
+        <w:rPr>
+          <w:rFonts w:ascii="Calibri" w:hAnsi="Calibri" w:cs="Calibri"/>
           <w:sz w:val="22"/>
           <w:szCs w:val="22"/>
           <w:lang w:val="id-ID"/>
         </w:rPr>
       </w:pPr>
-      <w:r>
+    </w:p>
+    <w:p>
+      <w:pPr>
+        <w:jc w:val="both"/>
+        <w:rPr>
+          <w:rFonts w:ascii="Calibri" w:hAnsi="Calibri" w:cs="Calibri"/>
+          <w:sz w:val="22"/>
+          <w:szCs w:val="22"/>
+          <w:lang w:val="id-ID"/>
+        </w:rPr>
+      </w:pPr>
+      <w:r>
+        <w:rPr>
+          <w:rFonts w:ascii="Calibri" w:hAnsi="Calibri" w:cs="Calibri"/>
+          <w:sz w:val="22"/>
+          <w:szCs w:val="22"/>
+          <w:lang w:val="id-ID"/>
+        </w:rPr>
+        <w:t>Biaya dapat di kirim ke:</w:t>
+      </w:r>
+    </w:p>
+    <w:p>
+      <w:pPr>
+        <w:jc w:val="both"/>
         <w:rPr>
           <w:rFonts w:ascii="Calibri" w:hAnsi="Calibri" w:cs="Calibri"/>
           <w:b/>
@@ -773,8 +819,19 @@
           <w:szCs w:val="22"/>
           <w:lang w:val="id-ID"/>
         </w:rPr>
+      </w:pPr>
+      <w:r>
+        <w:rPr>
+          <w:rFonts w:ascii="Calibri" w:hAnsi="Calibri" w:cs="Calibri"/>
+          <w:b/>
+          <w:sz w:val="22"/>
+          <w:szCs w:val="22"/>
+          <w:lang w:val="id-ID"/>
+        </w:rPr>
         <w:t>BNI atas nama Heli Siti Halimatul M.</w:t>
       </w:r>
+      <w:bookmarkStart w:id="0" w:name="_GoBack"/>
+      <w:bookmarkEnd w:id="0"/>
     </w:p>
     <w:p>
       <w:pPr>
@@ -894,8 +951,6 @@
           </wp:inline>
         </w:drawing>
       </w:r>
-      <w:bookmarkStart w:id="0" w:name="_GoBack"/>
-      <w:bookmarkEnd w:id="0"/>
     </w:p>
     <w:p>
       <w:pPr>

</xml_diff>